<commit_message>
docs: update API contract for stage 2 and private B2
</commit_message>
<xml_diff>
--- a/docs/Campus-Update-Backend-API-Contract.docx
+++ b/docs/Campus-Update-Backend-API-Contract.docx
@@ -1,5 +1,70 @@
 
-<file path=word/document.xml><?xml version="1.0" encoding="utf-8"?>
+<file path=customXml\item1.xml><?xml version="1.0" encoding="utf-8"?>
+<b:Sources xmlns:b="http://schemas.openxmlformats.org/officeDocument/2006/bibliography" xmlns="http://schemas.openxmlformats.org/officeDocument/2006/bibliography" SelectedStyle="/APA.XSL" StyleName="APA"/>
+</file>
+
+<file path=customXml\itemProps1.xml><?xml version="1.0" encoding="utf-8"?>
+<ds:datastoreItem xmlns:ds="http://schemas.openxmlformats.org/officeDocument/2006/customXml" ds:itemID="{EF278816-EC6F-A645-907D-7F25AECB1D4A}">
+  <ds:schemaRefs>
+    <ds:schemaRef ds:uri="http://schemas.openxmlformats.org/officeDocument/2006/bibliography"/>
+  </ds:schemaRefs>
+</ds:datastoreItem>
+</file>
+
+<file path=docProps\app.xml><?xml version="1.0" encoding="utf-8"?>
+<Properties xmlns="http://schemas.openxmlformats.org/officeDocument/2006/extended-properties" xmlns:vt="http://schemas.openxmlformats.org/officeDocument/2006/docPropsVTypes">
+  <Template>Normal.dotm</Template>
+  <TotalTime>0</TotalTime>
+  <Pages>1</Pages>
+  <Words>0</Words>
+  <Characters>0</Characters>
+  <Application>Microsoft Macintosh Word</Application>
+  <DocSecurity>0</DocSecurity>
+  <Lines>0</Lines>
+  <Paragraphs>0</Paragraphs>
+  <ScaleCrop>false</ScaleCrop>
+  <HeadingPairs>
+    <vt:vector size="2" baseType="variant">
+      <vt:variant>
+        <vt:lpstr>Title</vt:lpstr>
+      </vt:variant>
+      <vt:variant>
+        <vt:i4>1</vt:i4>
+      </vt:variant>
+    </vt:vector>
+  </HeadingPairs>
+  <TitlesOfParts>
+    <vt:vector size="1" baseType="lpstr">
+      <vt:lpstr/>
+    </vt:vector>
+  </TitlesOfParts>
+  <Manager/>
+  <Company/>
+  <LinksUpToDate>false</LinksUpToDate>
+  <CharactersWithSpaces>0</CharactersWithSpaces>
+  <SharedDoc>false</SharedDoc>
+  <HyperlinkBase/>
+  <HyperlinksChanged>false</HyperlinksChanged>
+  <AppVersion>14.0000</AppVersion>
+</Properties>
+</file>
+
+<file path=docProps\core.xml><?xml version="1.0" encoding="utf-8"?>
+<cp:coreProperties xmlns:cp="http://schemas.openxmlformats.org/package/2006/metadata/core-properties" xmlns:dc="http://purl.org/dc/elements/1.1/" xmlns:dcterms="http://purl.org/dc/terms/" xmlns:dcmitype="http://purl.org/dc/dcmitype/" xmlns:xsi="http://www.w3.org/2001/XMLSchema-instance">
+  <dc:title>Campus Update Backend API Contract</dc:title>
+  <dc:subject>Frontend integration guide</dc:subject>
+  <dc:creator>Campus Update</dc:creator>
+  <cp:keywords>Campus Update, API, frontend, Flutter, OpenAPI, JWT</cp:keywords>
+  <dc:description>generated by python-docx</dc:description>
+  <cp:lastModifiedBy/>
+  <cp:revision>1</cp:revision>
+  <dcterms:created xsi:type="dcterms:W3CDTF">2013-12-23T23:15:00Z</dcterms:created>
+  <dcterms:modified xsi:type="dcterms:W3CDTF">2013-12-23T23:15:00Z</dcterms:modified>
+  <cp:category/>
+</cp:coreProperties>
+</file>
+
+<file path=word\document.xml><?xml version="1.0" encoding="utf-8"?>
 <w:document xmlns:wpc="http://schemas.microsoft.com/office/word/2010/wordprocessingCanvas" xmlns:mo="http://schemas.microsoft.com/office/mac/office/2008/main" xmlns:mc="http://schemas.openxmlformats.org/markup-compatibility/2006" xmlns:mv="urn:schemas-microsoft-com:mac:vml" xmlns:o="urn:schemas-microsoft-com:office:office" xmlns:r="http://schemas.openxmlformats.org/officeDocument/2006/relationships" xmlns:m="http://schemas.openxmlformats.org/officeDocument/2006/math" xmlns:v="urn:schemas-microsoft-com:vml" xmlns:wp14="http://schemas.microsoft.com/office/word/2010/wordprocessingDrawing" xmlns:wp="http://schemas.openxmlformats.org/drawingml/2006/wordprocessingDrawing" xmlns:w10="urn:schemas-microsoft-com:office:word" xmlns:w="http://schemas.openxmlformats.org/wordprocessingml/2006/main" xmlns:w14="http://schemas.microsoft.com/office/word/2010/wordml" xmlns:wpg="http://schemas.microsoft.com/office/word/2010/wordprocessingGroup" xmlns:wpi="http://schemas.microsoft.com/office/word/2010/wordprocessingInk" xmlns:wne="http://schemas.microsoft.com/office/word/2006/wordml" xmlns:wps="http://schemas.microsoft.com/office/word/2010/wordprocessingShape" mc:Ignorable="w14 wp14">
   <w:body>
     <w:p>
@@ -6287,11 +6352,112 @@
       <w:cols w:space="720"/>
       <w:docGrid w:linePitch="360"/>
     </w:sectPr>
+    <w:p>
+      <w:pPr>
+        <w:pStyle w:val="Heading1"/>
+      </w:pPr>
+      <w:r>
+        <w:t>15. Stage 2 content, publishing and media</w:t>
+      </w:r>
+    </w:p>
+    <w:p>
+      <w:r>
+        <w:t>Content management now supports school-scoped editing and archive/delete operations for SchoolAdmin and SuperAdmin users. Audience hierarchy validation is applied to every create and update request, and users cannot modify content outside their institution unless they are SuperAdmin.</w:t>
+      </w:r>
+    </w:p>
+    <w:p>
+      <w:r>
+        <w:t>Content status transitions are role-controlled: Draft may be submitted for PendingApproval; SuperAdmin may approve or reject pending content; published content may be archived. PublishedAt is set when content is approved. Invalid transitions return 400 and inaccessible content returns 403 or 404 according to the existing access rules.</w:t>
+      </w:r>
+    </w:p>
+    <w:p>
+      <w:r>
+        <w:t>The feed supports text search across title, summary and body, in addition to content type, urgency, academic scope and pagination filters. Feed results remain limited to published content visible to the authenticated user and never cross institution boundaries.</w:t>
+      </w:r>
+    </w:p>
+    <w:p>
+      <w:r>
+        <w:t>Academic calendar replacement is available to authorized administrators. When a new calendar is marked official, the previous official calendar for that institution is deactivated. Calendar reads remain institution-scoped.</w:t>
+      </w:r>
+    </w:p>
+    <w:p>
+      <w:r>
+        <w:t>Media storage is configured for Backblaze B2 through the S3-compatible API. Development, staging and production use separate private buckets and separate application keys. Required environment variables are B2__Endpoint, B2__Region, B2__BucketName, B2__KeyId and B2__ApplicationKey. B2__PublicBaseUrl is optional and is not an authorization mechanism. The media API must issue authorized or short-lived signed download URLs when provider-backed uploads are enabled.</w:t>
+      </w:r>
+    </w:p>
+    <w:p>
+      <w:r>
+        <w:t>The remaining Stage 2 media work includes the B2 upload adapter, attachment type and size validation, safe file names, complete event/advertisement/media response details, advertisement moderation and payment confirmation, and additional content-management tests.</w:t>
+      </w:r>
+    </w:p>
   </w:body>
 </w:document>
 </file>
 
-<file path=word/footer1.xml><?xml version="1.0" encoding="utf-8"?>
+<file path=word\fontTable.xml><?xml version="1.0" encoding="utf-8"?>
+<w:fonts xmlns:mc="http://schemas.openxmlformats.org/markup-compatibility/2006" xmlns:r="http://schemas.openxmlformats.org/officeDocument/2006/relationships" xmlns:w="http://schemas.openxmlformats.org/wordprocessingml/2006/main" xmlns:w14="http://schemas.microsoft.com/office/word/2010/wordml" mc:Ignorable="w14">
+  <w:font w:name="Symbol">
+    <w:panose1 w:val="00000000000000000000"/>
+    <w:charset w:val="02"/>
+    <w:family w:val="auto"/>
+    <w:pitch w:val="variable"/>
+    <w:sig w:usb0="00000000" w:usb1="10000000" w:usb2="00000000" w:usb3="00000000" w:csb0="80000000" w:csb1="00000000"/>
+  </w:font>
+  <w:font w:name="Times New Roman">
+    <w:panose1 w:val="02020603050405020304"/>
+    <w:charset w:val="00"/>
+    <w:family w:val="auto"/>
+    <w:pitch w:val="variable"/>
+    <w:sig w:usb0="E0002AFF" w:usb1="C0007841" w:usb2="00000009" w:usb3="00000000" w:csb0="000001FF" w:csb1="00000000"/>
+  </w:font>
+  <w:font w:name="Cambria">
+    <w:panose1 w:val="02040503050406030204"/>
+    <w:charset w:val="00"/>
+    <w:family w:val="auto"/>
+    <w:pitch w:val="variable"/>
+    <w:sig w:usb0="E00002FF" w:usb1="400004FF" w:usb2="00000000" w:usb3="00000000" w:csb0="0000019F" w:csb1="00000000"/>
+  </w:font>
+  <w:font w:name="ＭＳ 明朝">
+    <w:panose1 w:val="00000000000000000000"/>
+    <w:charset w:val="80"/>
+    <w:family w:val="roman"/>
+    <w:notTrueType/>
+    <w:pitch w:val="fixed"/>
+    <w:sig w:usb0="00000001" w:usb1="08070000" w:usb2="00000010" w:usb3="00000000" w:csb0="00020000" w:csb1="00000000"/>
+  </w:font>
+  <w:font w:name="Calibri">
+    <w:panose1 w:val="020F0502020204030204"/>
+    <w:charset w:val="00"/>
+    <w:family w:val="auto"/>
+    <w:pitch w:val="variable"/>
+    <w:sig w:usb0="E10002FF" w:usb1="4000ACFF" w:usb2="00000009" w:usb3="00000000" w:csb0="0000019F" w:csb1="00000000"/>
+  </w:font>
+  <w:font w:name="ＭＳ ゴシック">
+    <w:panose1 w:val="00000000000000000000"/>
+    <w:charset w:val="80"/>
+    <w:family w:val="modern"/>
+    <w:notTrueType/>
+    <w:pitch w:val="fixed"/>
+    <w:sig w:usb0="00000001" w:usb1="08070000" w:usb2="00000010" w:usb3="00000000" w:csb0="00020000" w:csb1="00000000"/>
+  </w:font>
+  <w:font w:name="Courier">
+    <w:panose1 w:val="02000500000000000000"/>
+    <w:charset w:val="00"/>
+    <w:family w:val="auto"/>
+    <w:pitch w:val="variable"/>
+    <w:sig w:usb0="00000003" w:usb1="00000000" w:usb2="00000000" w:usb3="00000000" w:csb0="00000001" w:csb1="00000000"/>
+  </w:font>
+  <w:font w:name="Arial">
+    <w:panose1 w:val="020B0604020202020204"/>
+    <w:charset w:val="00"/>
+    <w:family w:val="auto"/>
+    <w:pitch w:val="variable"/>
+    <w:sig w:usb0="E0002AFF" w:usb1="C0007843" w:usb2="00000009" w:usb3="00000000" w:csb0="000001FF" w:csb1="00000000"/>
+  </w:font>
+</w:fonts>
+</file>
+
+<file path=word\footer1.xml><?xml version="1.0" encoding="utf-8"?>
 <w:ftr xmlns:m="http://schemas.openxmlformats.org/officeDocument/2006/math" xmlns:mc="http://schemas.openxmlformats.org/markup-compatibility/2006" xmlns:mo="http://schemas.microsoft.com/office/mac/office/2008/main" xmlns:mv="urn:schemas-microsoft-com:mac:vml" xmlns:o="urn:schemas-microsoft-com:office:office" xmlns:r="http://schemas.openxmlformats.org/officeDocument/2006/relationships" xmlns:v="urn:schemas-microsoft-com:vml" xmlns:w10="urn:schemas-microsoft-com:office:word" xmlns:w14="http://schemas.microsoft.com/office/word/2010/wordml" xmlns:w="http://schemas.openxmlformats.org/wordprocessingml/2006/main" xmlns:wne="http://schemas.microsoft.com/office/word/2006/wordml" xmlns:wp14="http://schemas.microsoft.com/office/word/2010/wordprocessingDrawing" xmlns:wp="http://schemas.openxmlformats.org/drawingml/2006/wordprocessingDrawing" xmlns:wpc="http://schemas.microsoft.com/office/word/2010/wordprocessingCanvas" xmlns:wpg="http://schemas.microsoft.com/office/word/2010/wordprocessingGroup" xmlns:wpi="http://schemas.microsoft.com/office/word/2010/wordprocessingInk" xmlns:wps="http://schemas.microsoft.com/office/word/2010/wordprocessingShape" mc:Ignorable="w14 wp14">
   <w:p>
     <w:pPr>
@@ -6311,7 +6477,7 @@
 </w:ftr>
 </file>
 
-<file path=word/header1.xml><?xml version="1.0" encoding="utf-8"?>
+<file path=word\header1.xml><?xml version="1.0" encoding="utf-8"?>
 <w:hdr xmlns:m="http://schemas.openxmlformats.org/officeDocument/2006/math" xmlns:mc="http://schemas.openxmlformats.org/markup-compatibility/2006" xmlns:mo="http://schemas.microsoft.com/office/mac/office/2008/main" xmlns:mv="urn:schemas-microsoft-com:mac:vml" xmlns:o="urn:schemas-microsoft-com:office:office" xmlns:r="http://schemas.openxmlformats.org/officeDocument/2006/relationships" xmlns:v="urn:schemas-microsoft-com:vml" xmlns:w10="urn:schemas-microsoft-com:office:word" xmlns:w14="http://schemas.microsoft.com/office/word/2010/wordml" xmlns:w="http://schemas.openxmlformats.org/wordprocessingml/2006/main" xmlns:wne="http://schemas.microsoft.com/office/word/2006/wordml" xmlns:wp14="http://schemas.microsoft.com/office/word/2010/wordprocessingDrawing" xmlns:wp="http://schemas.openxmlformats.org/drawingml/2006/wordprocessingDrawing" xmlns:wpc="http://schemas.microsoft.com/office/word/2010/wordprocessingCanvas" xmlns:wpg="http://schemas.microsoft.com/office/word/2010/wordprocessingGroup" xmlns:wpi="http://schemas.microsoft.com/office/word/2010/wordprocessingInk" xmlns:wps="http://schemas.microsoft.com/office/word/2010/wordprocessingShape" mc:Ignorable="w14 wp14">
   <w:p>
     <w:pPr>
@@ -6331,7 +6497,7 @@
 </w:hdr>
 </file>
 
-<file path=word/numbering.xml><?xml version="1.0" encoding="utf-8"?>
+<file path=word\numbering.xml><?xml version="1.0" encoding="utf-8"?>
 <w:numbering xmlns:wpc="http://schemas.microsoft.com/office/word/2010/wordprocessingCanvas" xmlns:mo="http://schemas.microsoft.com/office/mac/office/2008/main" xmlns:mc="http://schemas.openxmlformats.org/markup-compatibility/2006" xmlns:mv="urn:schemas-microsoft-com:mac:vml" xmlns:o="urn:schemas-microsoft-com:office:office" xmlns:r="http://schemas.openxmlformats.org/officeDocument/2006/relationships" xmlns:m="http://schemas.openxmlformats.org/officeDocument/2006/math" xmlns:v="urn:schemas-microsoft-com:vml" xmlns:wp14="http://schemas.microsoft.com/office/word/2010/wordprocessingDrawing" xmlns:wp="http://schemas.openxmlformats.org/drawingml/2006/wordprocessingDrawing" xmlns:w10="urn:schemas-microsoft-com:office:word" xmlns:w="http://schemas.openxmlformats.org/wordprocessingml/2006/main" xmlns:w14="http://schemas.microsoft.com/office/word/2010/wordml" xmlns:wpg="http://schemas.microsoft.com/office/word/2010/wordprocessingGroup" xmlns:wpi="http://schemas.microsoft.com/office/word/2010/wordprocessingInk" xmlns:wne="http://schemas.microsoft.com/office/word/2006/wordml" xmlns:wps="http://schemas.microsoft.com/office/word/2010/wordprocessingShape" mc:Ignorable="w14 wp14">
   <w:abstractNum w:abstractNumId="0">
     <w:nsid w:val="FFFFFF7C"/>
@@ -6534,7 +6700,62 @@
 </w:numbering>
 </file>
 
-<file path=word/styles.xml><?xml version="1.0" encoding="utf-8"?>
+<file path=word\settings.xml><?xml version="1.0" encoding="utf-8"?>
+<w:settings xmlns:mc="http://schemas.openxmlformats.org/markup-compatibility/2006" xmlns:o="urn:schemas-microsoft-com:office:office" xmlns:r="http://schemas.openxmlformats.org/officeDocument/2006/relationships" xmlns:m="http://schemas.openxmlformats.org/officeDocument/2006/math" xmlns:v="urn:schemas-microsoft-com:vml" xmlns:w10="urn:schemas-microsoft-com:office:word" xmlns:w="http://schemas.openxmlformats.org/wordprocessingml/2006/main" xmlns:w14="http://schemas.microsoft.com/office/word/2010/wordml" xmlns:sl="http://schemas.openxmlformats.org/schemaLibrary/2006/main" mc:Ignorable="w14">
+  <w:zoom w:val="bestFit"/>
+  <w:proofState w:spelling="clean" w:grammar="clean"/>
+  <w:defaultTabStop w:val="720"/>
+  <w:characterSpacingControl w:val="doNotCompress"/>
+  <w:savePreviewPicture/>
+  <w:compat>
+    <w:useFELayout/>
+    <w:compatSetting w:name="compatibilityMode" w:uri="http://schemas.microsoft.com/office/word" w:val="14"/>
+    <w:compatSetting w:name="overrideTableStyleFontSizeAndJustification" w:uri="http://schemas.microsoft.com/office/word" w:val="1"/>
+    <w:compatSetting w:name="enableOpenTypeFeatures" w:uri="http://schemas.microsoft.com/office/word" w:val="1"/>
+    <w:compatSetting w:name="doNotFlipMirrorIndents" w:uri="http://schemas.microsoft.com/office/word" w:val="1"/>
+  </w:compat>
+  <w:rsids>
+    <w:rsidRoot w:val="00B47730"/>
+    <w:rsid w:val="00034616"/>
+    <w:rsid w:val="0006063C"/>
+    <w:rsid w:val="0015074B"/>
+    <w:rsid w:val="0029639D"/>
+    <w:rsid w:val="00326F90"/>
+    <w:rsid w:val="00AA1D8D"/>
+    <w:rsid w:val="00B47730"/>
+    <w:rsid w:val="00CB0664"/>
+    <w:rsid w:val="00FC693F"/>
+  </w:rsids>
+  <m:mathPr>
+    <m:mathFont m:val="Cambria Math"/>
+    <m:brkBin m:val="before"/>
+    <m:brkBinSub m:val="--"/>
+    <m:smallFrac m:val="0"/>
+    <m:dispDef/>
+    <m:lMargin m:val="0"/>
+    <m:rMargin m:val="0"/>
+    <m:defJc m:val="centerGroup"/>
+    <m:wrapIndent m:val="1440"/>
+    <m:intLim m:val="subSup"/>
+    <m:naryLim m:val="undOvr"/>
+  </m:mathPr>
+  <w:themeFontLang w:val="en-US" w:eastAsia="ja-JP"/>
+  <w:clrSchemeMapping w:bg1="light1" w:t1="dark1" w:bg2="light2" w:t2="dark2" w:accent1="accent1" w:accent2="accent2" w:accent3="accent3" w:accent4="accent4" w:accent5="accent5" w:accent6="accent6" w:hyperlink="hyperlink" w:followedHyperlink="followedHyperlink"/>
+  <w:doNotAutoCompressPictures/>
+  <w:shapeDefaults>
+    <o:shapedefaults v:ext="edit" spidmax="1027"/>
+    <o:shapelayout v:ext="edit">
+      <o:idmap v:ext="edit" data="1"/>
+    </o:shapelayout>
+  </w:shapeDefaults>
+  <w:decimalSymbol w:val="."/>
+  <w:listSeparator w:val=","/>
+  <w14:docId w14:val="24062061"/>
+  <w14:defaultImageDpi w14:val="300"/>
+</w:settings>
+</file>
+
+<file path=word\styles.xml><?xml version="1.0" encoding="utf-8"?>
 <w:styles xmlns:mc="http://schemas.openxmlformats.org/markup-compatibility/2006" xmlns:r="http://schemas.openxmlformats.org/officeDocument/2006/relationships" xmlns:w="http://schemas.openxmlformats.org/wordprocessingml/2006/main" xmlns:w14="http://schemas.microsoft.com/office/word/2010/wordml" mc:Ignorable="w14">
   <w:docDefaults>
     <w:rPrDefault>
@@ -18400,7 +18621,7 @@
 </w:styles>
 </file>
 
-<file path=word/stylesWithEffects.xml><?xml version="1.0" encoding="utf-8"?>
+<file path=word\stylesWithEffects.xml><?xml version="1.0" encoding="utf-8"?>
 <w:styles xmlns:wpc="http://schemas.microsoft.com/office/word/2010/wordprocessingCanvas" xmlns:mo="http://schemas.microsoft.com/office/mac/office/2008/main" xmlns:mc="http://schemas.openxmlformats.org/markup-compatibility/2006" xmlns:mv="urn:schemas-microsoft-com:mac:vml" xmlns:o="urn:schemas-microsoft-com:office:office" xmlns:r="http://schemas.openxmlformats.org/officeDocument/2006/relationships" xmlns:m="http://schemas.openxmlformats.org/officeDocument/2006/math" xmlns:v="urn:schemas-microsoft-com:vml" xmlns:wp14="http://schemas.microsoft.com/office/word/2010/wordprocessingDrawing" xmlns:wp="http://schemas.openxmlformats.org/drawingml/2006/wordprocessingDrawing" xmlns:w10="urn:schemas-microsoft-com:office:word" xmlns:w="http://schemas.openxmlformats.org/wordprocessingml/2006/main" xmlns:w14="http://schemas.microsoft.com/office/word/2010/wordml" xmlns:wpg="http://schemas.microsoft.com/office/word/2010/wordprocessingGroup" xmlns:wpi="http://schemas.microsoft.com/office/word/2010/wordprocessingInk" xmlns:wne="http://schemas.microsoft.com/office/word/2006/wordml" xmlns:wps="http://schemas.microsoft.com/office/word/2010/wordprocessingShape" mc:Ignorable="w14 wp14">
   <w:docDefaults>
     <w:rPrDefault>
@@ -30202,7 +30423,7 @@
 </w:styles>
 </file>
 
-<file path=word/theme/theme1.xml><?xml version="1.0" encoding="utf-8"?>
+<file path=word\theme\theme1.xml><?xml version="1.0" encoding="utf-8"?>
 <a:theme xmlns:a="http://schemas.openxmlformats.org/drawingml/2006/main" name="Office Theme">
   <a:themeElements>
     <a:clrScheme name="Office">
@@ -30522,14 +30743,9 @@
 </a:theme>
 </file>
 
-<file path=customXml/item1.xml><?xml version="1.0" encoding="utf-8"?>
-<b:Sources xmlns:b="http://schemas.openxmlformats.org/officeDocument/2006/bibliography" xmlns="http://schemas.openxmlformats.org/officeDocument/2006/bibliography" SelectedStyle="/APA.XSL" StyleName="APA"/>
-</file>
-
-<file path=customXml/itemProps1.xml><?xml version="1.0" encoding="utf-8"?>
-<ds:datastoreItem xmlns:ds="http://schemas.openxmlformats.org/officeDocument/2006/customXml" ds:itemID="{EF278816-EC6F-A645-907D-7F25AECB1D4A}">
-  <ds:schemaRefs>
-    <ds:schemaRef ds:uri="http://schemas.openxmlformats.org/officeDocument/2006/bibliography"/>
-  </ds:schemaRefs>
-</ds:datastoreItem>
+<file path=word\webSettings.xml><?xml version="1.0" encoding="utf-8"?>
+<w:webSettings xmlns:mc="http://schemas.openxmlformats.org/markup-compatibility/2006" xmlns:r="http://schemas.openxmlformats.org/officeDocument/2006/relationships" xmlns:w="http://schemas.openxmlformats.org/wordprocessingml/2006/main" xmlns:w14="http://schemas.microsoft.com/office/word/2010/wordml" mc:Ignorable="w14">
+  <w:allowPNG/>
+  <w:doNotSaveAsSingleFile/>
+</w:webSettings>
 </file>
</xml_diff>

<commit_message>
docs: use deployed staging and production API URLs
</commit_message>
<xml_diff>
--- a/docs/Campus-Update-Backend-API-Contract.docx
+++ b/docs/Campus-Update-Backend-API-Contract.docx
@@ -385,7 +385,7 @@
                 <w:rFonts w:ascii="Calibri" w:hAnsi="Calibri"/>
                 <w:sz w:val="18"/>
               </w:rPr>
-              <w:t>http://localhost:5124</w:t>
+              <w:t>https://campus-update-api-staging.vercel.app</w:t>
             </w:r>
           </w:p>
         </w:tc>
@@ -1210,7 +1210,7 @@
                 <w:rFonts w:ascii="Calibri" w:hAnsi="Calibri"/>
                 <w:sz w:val="18"/>
               </w:rPr>
-              <w:t>http://localhost:5124</w:t>
+              <w:t>https://campus-update-api-staging.vercel.app</w:t>
             </w:r>
           </w:p>
         </w:tc>

</xml_diff>

<commit_message>
docs: remove local server URLs from contract
</commit_message>
<xml_diff>
--- a/docs/Campus-Update-Backend-API-Contract.docx
+++ b/docs/Campus-Update-Backend-API-Contract.docx
@@ -386,57 +386,6 @@
                 <w:sz w:val="18"/>
               </w:rPr>
               <w:t>https://campus-update-api-staging.vercel.app</w:t>
-            </w:r>
-          </w:p>
-        </w:tc>
-      </w:tr>
-      <w:tr>
-        <w:tc>
-          <w:tcPr>
-            <w:tcW w:type="dxa" w:w="2700"/>
-            <w:tcMar>
-              <w:top w:w="80" w:type="dxa"/>
-              <w:start w:w="120" w:type="dxa"/>
-              <w:bottom w:w="80" w:type="dxa"/>
-              <w:end w:w="120" w:type="dxa"/>
-            </w:tcMar>
-            <w:vAlign w:val="center"/>
-          </w:tcPr>
-          <w:p>
-            <w:pPr>
-              <w:spacing w:after="0"/>
-            </w:pPr>
-            <w:r>
-              <w:rPr>
-                <w:rFonts w:ascii="Calibri" w:hAnsi="Calibri"/>
-                <w:color w:val="0B2545"/>
-                <w:sz w:val="18"/>
-              </w:rPr>
-              <w:t>Docker base URL</w:t>
-            </w:r>
-          </w:p>
-        </w:tc>
-        <w:tc>
-          <w:tcPr>
-            <w:tcW w:type="dxa" w:w="6660"/>
-            <w:tcMar>
-              <w:top w:w="80" w:type="dxa"/>
-              <w:start w:w="120" w:type="dxa"/>
-              <w:bottom w:w="80" w:type="dxa"/>
-              <w:end w:w="120" w:type="dxa"/>
-            </w:tcMar>
-            <w:vAlign w:val="center"/>
-          </w:tcPr>
-          <w:p>
-            <w:pPr>
-              <w:spacing w:after="0"/>
-            </w:pPr>
-            <w:r>
-              <w:rPr>
-                <w:rFonts w:ascii="Calibri" w:hAnsi="Calibri"/>
-                <w:sz w:val="18"/>
-              </w:rPr>
-              <w:t>http://localhost:8080</w:t>
             </w:r>
           </w:p>
         </w:tc>
@@ -1160,108 +1109,6 @@
                 <w:sz w:val="19"/>
               </w:rPr>
               <w:t>Contract</w:t>
-            </w:r>
-          </w:p>
-        </w:tc>
-      </w:tr>
-      <w:tr>
-        <w:tc>
-          <w:tcPr>
-            <w:tcW w:type="dxa" w:w="2600"/>
-            <w:tcMar>
-              <w:top w:w="80" w:type="dxa"/>
-              <w:start w:w="120" w:type="dxa"/>
-              <w:bottom w:w="80" w:type="dxa"/>
-              <w:end w:w="120" w:type="dxa"/>
-            </w:tcMar>
-            <w:vAlign w:val="center"/>
-          </w:tcPr>
-          <w:p>
-            <w:pPr>
-              <w:spacing w:after="0"/>
-            </w:pPr>
-            <w:r>
-              <w:rPr>
-                <w:rFonts w:ascii="Calibri" w:hAnsi="Calibri"/>
-                <w:color w:val="0B2545"/>
-                <w:sz w:val="18"/>
-              </w:rPr>
-              <w:t>Development API</w:t>
-            </w:r>
-          </w:p>
-        </w:tc>
-        <w:tc>
-          <w:tcPr>
-            <w:tcW w:type="dxa" w:w="6760"/>
-            <w:tcMar>
-              <w:top w:w="80" w:type="dxa"/>
-              <w:start w:w="120" w:type="dxa"/>
-              <w:bottom w:w="80" w:type="dxa"/>
-              <w:end w:w="120" w:type="dxa"/>
-            </w:tcMar>
-            <w:vAlign w:val="center"/>
-          </w:tcPr>
-          <w:p>
-            <w:pPr>
-              <w:spacing w:after="0"/>
-            </w:pPr>
-            <w:r>
-              <w:rPr>
-                <w:rFonts w:ascii="Calibri" w:hAnsi="Calibri"/>
-                <w:sz w:val="18"/>
-              </w:rPr>
-              <w:t>https://campus-update-api-staging.vercel.app</w:t>
-            </w:r>
-          </w:p>
-        </w:tc>
-      </w:tr>
-      <w:tr>
-        <w:tc>
-          <w:tcPr>
-            <w:tcW w:type="dxa" w:w="2600"/>
-            <w:tcMar>
-              <w:top w:w="80" w:type="dxa"/>
-              <w:start w:w="120" w:type="dxa"/>
-              <w:bottom w:w="80" w:type="dxa"/>
-              <w:end w:w="120" w:type="dxa"/>
-            </w:tcMar>
-            <w:vAlign w:val="center"/>
-          </w:tcPr>
-          <w:p>
-            <w:pPr>
-              <w:spacing w:after="0"/>
-            </w:pPr>
-            <w:r>
-              <w:rPr>
-                <w:rFonts w:ascii="Calibri" w:hAnsi="Calibri"/>
-                <w:color w:val="0B2545"/>
-                <w:sz w:val="18"/>
-              </w:rPr>
-              <w:t>Docker API</w:t>
-            </w:r>
-          </w:p>
-        </w:tc>
-        <w:tc>
-          <w:tcPr>
-            <w:tcW w:type="dxa" w:w="6760"/>
-            <w:tcMar>
-              <w:top w:w="80" w:type="dxa"/>
-              <w:start w:w="120" w:type="dxa"/>
-              <w:bottom w:w="80" w:type="dxa"/>
-              <w:end w:w="120" w:type="dxa"/>
-            </w:tcMar>
-            <w:vAlign w:val="center"/>
-          </w:tcPr>
-          <w:p>
-            <w:pPr>
-              <w:spacing w:after="0"/>
-            </w:pPr>
-            <w:r>
-              <w:rPr>
-                <w:rFonts w:ascii="Calibri" w:hAnsi="Calibri"/>
-                <w:sz w:val="18"/>
-              </w:rPr>
-              <w:t>http://localhost:8080</w:t>
             </w:r>
           </w:p>
         </w:tc>

</xml_diff>

<commit_message>
docs: add frontend onboarding integration guide
</commit_message>
<xml_diff>
--- a/docs/Campus-Update-Backend-API-Contract.docx
+++ b/docs/Campus-Update-Backend-API-Contract.docx
@@ -6237,6 +6237,59 @@
         <w:t>The remaining Stage 2 media work includes the B2 upload adapter, attachment type and size validation, safe file names, complete event/advertisement/media response details, advertisement moderation and payment confirmation, and additional content-management tests.</w:t>
       </w:r>
     </w:p>
+    <w:p>
+      <w:pPr>
+        <w:pStyle w:val="Heading1"/>
+      </w:pPr>
+      <w:r>
+        <w:t>16. Frontend onboarding integration</w:t>
+      </w:r>
+    </w:p>
+    <w:p>
+      <w:r>
+        <w:t>Onboarding is a three-screen frontend flow: collect authentication details, select Student or Staff, then collect the academic placement. The API uses one final registration request; the frontend keeps the values from the earlier screens in local form state and submits them when the user selects Create account.</w:t>
+      </w:r>
+    </w:p>
+    <w:p>
+      <w:r>
+        <w:t>Before the academic selection screen, call GET /api/v1/schools. Use the returned institution, faculty, department, programme and academic-level IDs for selectors. Do not submit display names. Each child selection must belong to the selected parent.</w:t>
+      </w:r>
+    </w:p>
+    <w:p>
+      <w:r>
+        <w:t>Registration endpoint: POST /api/v1/auth/register. Required fields are email, password, firstName, lastName, role and institutionId. role must be Student or Staff; SchoolAdmin and SuperAdmin accounts cannot self-register.</w:t>
+      </w:r>
+    </w:p>
+    <w:p>
+      <w:r>
+        <w:t>Student form fields: first name, last name, email, password, institution, faculty, department, programme, academic level, and optional matriculationOrStaffNumber. Submit role as Student.</w:t>
+      </w:r>
+    </w:p>
+    <w:p>
+      <w:r>
+        <w:t>Staff form fields: first name, last name, email, password, institution, optional faculty and department, and optional staff number in matriculationOrStaffNumber. programmeId and academicLevelId may be null. Submit role as Staff.</w:t>
+      </w:r>
+    </w:p>
+    <w:p>
+      <w:r>
+        <w:t>The API requires passwords of at least 8 characters, validates email format, rejects duplicate email addresses with 409, and rejects invalid academic hierarchies with 400. Confirm password, Remember me, and Skip buttons are frontend-only controls.</w:t>
+      </w:r>
+    </w:p>
+    <w:p>
+      <w:r>
+        <w:t>A successful registration returns HTTP 201 with userId, accessToken, refreshToken and expiresAt. Store tokens using platform-secure storage. The user is authenticated immediately; no OTP or email verification step is currently implemented.</w:t>
+      </w:r>
+    </w:p>
+    <w:p>
+      <w:r>
+        <w:t>Current authentication gaps: OTP verification, forgot-password/reset-password, Google sign-in, and saving incomplete onboarding progress are not implemented. These screens should be treated as future API features until their endpoints are added.</w:t>
+      </w:r>
+    </w:p>
+    <w:p>
+      <w:r>
+        <w:t>After registration, use GET /api/v1/auth/profile to load the account and PUT /api/v1/auth/academic-settings to update academic placement and feed preferences. Use POST /api/v1/auth/login for later sign-in and POST /api/v1/auth/refresh to rotate tokens.</w:t>
+      </w:r>
+    </w:p>
   </w:body>
 </w:document>
 </file>

</xml_diff>

<commit_message>
feat: add superadmin pending content queue
</commit_message>
<xml_diff>
--- a/docs/Campus-Update-Backend-API-Contract.docx
+++ b/docs/Campus-Update-Backend-API-Contract.docx
@@ -179,7 +179,7 @@
         <w:pStyle w:val="Small"/>
       </w:pPr>
       <w:r>
-        <w:t>Documentation revision: 27 September 2026</w:t>
+        <w:t>Documentation revision: 13 October 2026</w:t>
       </w:r>
     </w:p>
     <w:p>
@@ -7809,6 +7809,183 @@
     </w:p>
     <w:p>
       <w:pPr>
+        <w:pStyle w:val="Heading2"/>
+      </w:pPr>
+      <w:r>
+        <w:t xml:space="preserve">Review pending content</w:t>
+      </w:r>
+    </w:p>
+    <w:p>
+      <w:pPr>
+        <w:pStyle w:val="Endpoint"/>
+      </w:pPr>
+      <w:r>
+        <w:t xml:space="preserve">GET /api/v1/admin/content/pending</w:t>
+      </w:r>
+    </w:p>
+    <w:p>
+      <w:pPr>
+        <w:pStyle w:val="Small"/>
+      </w:pPr>
+      <w:r>
+        <w:t xml:space="preserve">Access: SuperAdmin only  |  Success: 200 + paginated response</w:t>
+      </w:r>
+    </w:p>
+    <w:p>
+      <w:r>
+        <w:t xml:space="preserve">Optional query parameters: institutionId, type (News, Announcement, Event, Advertisement), search, page (default 1) and pageSize (default 20, maximum 100). The endpoint returns PendingApproval items only.</w:t>
+      </w:r>
+    </w:p>
+    <w:p>
+      <w:pPr>
+        <w:pStyle w:val="Code"/>
+        <w:keepNext/>
+        <w:keepLines/>
+        <w:shd w:fill="F2F5F9"/>
+      </w:pPr>
+      <w:r>
+        <w:t xml:space="preserve">{</w:t>
+      </w:r>
+    </w:p>
+    <w:p>
+      <w:pPr>
+        <w:pStyle w:val="Code"/>
+        <w:keepNext/>
+        <w:keepLines/>
+        <w:shd w:fill="F2F5F9"/>
+      </w:pPr>
+      <w:r>
+        <w:t xml:space="preserve">  "page": 1, "pageSize": 20, "totalCount": 1,</w:t>
+      </w:r>
+    </w:p>
+    <w:p>
+      <w:pPr>
+        <w:pStyle w:val="Code"/>
+        <w:keepNext/>
+        <w:keepLines/>
+        <w:shd w:fill="F2F5F9"/>
+      </w:pPr>
+      <w:r>
+        <w:t xml:space="preserve">  "items": [{ "id": "&lt;content UUID&gt;", "title": "Orientation update", "body": "Review details",</w:t>
+      </w:r>
+    </w:p>
+    <w:p>
+      <w:pPr>
+        <w:pStyle w:val="Code"/>
+        <w:keepNext/>
+        <w:keepLines/>
+        <w:shd w:fill="F2F5F9"/>
+      </w:pPr>
+      <w:r>
+        <w:t xml:space="preserve">    "summary": null, "category": "Campus", "imageUrl": null, "type": "Event",</w:t>
+      </w:r>
+    </w:p>
+    <w:p>
+      <w:pPr>
+        <w:pStyle w:val="Code"/>
+        <w:keepNext/>
+        <w:keepLines/>
+        <w:shd w:fill="F2F5F9"/>
+      </w:pPr>
+      <w:r>
+        <w:t xml:space="preserve">    "status": "PendingApproval", "urgency": "Normal", "sourceType": "Official",</w:t>
+      </w:r>
+    </w:p>
+    <w:p>
+      <w:pPr>
+        <w:pStyle w:val="Code"/>
+        <w:keepNext/>
+        <w:keepLines/>
+        <w:shd w:fill="F2F5F9"/>
+      </w:pPr>
+      <w:r>
+        <w:t xml:space="preserve">    "sourceName": "Osun State University", "createdAt": "2026-10-13T10:00:00Z",</w:t>
+      </w:r>
+    </w:p>
+    <w:p>
+      <w:pPr>
+        <w:pStyle w:val="Code"/>
+        <w:keepNext/>
+        <w:keepLines/>
+        <w:shd w:fill="F2F5F9"/>
+      </w:pPr>
+      <w:r>
+        <w:t xml:space="preserve">    "eventStartsAt": "2026-10-20T09:00:00Z", "eventEndsAt": null, "eventLocation": "Main auditorium",</w:t>
+      </w:r>
+    </w:p>
+    <w:p>
+      <w:pPr>
+        <w:pStyle w:val="Code"/>
+        <w:keepNext/>
+        <w:keepLines/>
+        <w:shd w:fill="F2F5F9"/>
+      </w:pPr>
+      <w:r>
+        <w:t xml:space="preserve">    "registrationUrl": null, "sponsorName": null, "targetUrl": null,</w:t>
+      </w:r>
+    </w:p>
+    <w:p>
+      <w:pPr>
+        <w:pStyle w:val="Code"/>
+        <w:keepNext/>
+        <w:keepLines/>
+        <w:shd w:fill="F2F5F9"/>
+      </w:pPr>
+      <w:r>
+        <w:t xml:space="preserve">    "authorId": "&lt;user UUID&gt;", "authorEmail": "admin@example.test", "authorName": "Campus Admin",</w:t>
+      </w:r>
+    </w:p>
+    <w:p>
+      <w:pPr>
+        <w:pStyle w:val="Code"/>
+        <w:keepNext/>
+        <w:keepLines/>
+        <w:shd w:fill="F2F5F9"/>
+      </w:pPr>
+      <w:r>
+        <w:t xml:space="preserve">    "audiences": [{ "institutionId": "&lt;institution UUID&gt;", "facultyId": null,</w:t>
+      </w:r>
+    </w:p>
+    <w:p>
+      <w:pPr>
+        <w:pStyle w:val="Code"/>
+        <w:keepNext/>
+        <w:keepLines/>
+        <w:shd w:fill="F2F5F9"/>
+      </w:pPr>
+      <w:r>
+        <w:t xml:space="preserve">      "departmentId": null, "programmeId": null, "academicLevelId": null, "targetAudience": "All" }]</w:t>
+      </w:r>
+    </w:p>
+    <w:p>
+      <w:pPr>
+        <w:pStyle w:val="Code"/>
+        <w:keepNext/>
+        <w:keepLines/>
+        <w:shd w:fill="F2F5F9"/>
+      </w:pPr>
+      <w:r>
+        <w:t xml:space="preserve">  }]</w:t>
+      </w:r>
+    </w:p>
+    <w:p>
+      <w:pPr>
+        <w:pStyle w:val="Code"/>
+        <w:keepNext/>
+        <w:keepLines/>
+        <w:shd w:fill="F2F5F9"/>
+      </w:pPr>
+      <w:r>
+        <w:t xml:space="preserve">}</w:t>
+      </w:r>
+    </w:p>
+    <w:p>
+      <w:r>
+        <w:t xml:space="preserve">Approve or reject an item with PATCH /api/v1/content/{id}/status and {"status":"Published"} or {"status":"Rejected"}.</w:t>
+      </w:r>
+    </w:p>
+    <w:p>
+      <w:pPr>
         <w:pStyle w:val="Heading1"/>
         <w:pageBreakBefore/>
       </w:pPr>

</xml_diff>

<commit_message>
feat: add admin portal metrics and account security routes
</commit_message>
<xml_diff>
--- a/docs/Campus-Update-Backend-API-Contract.docx
+++ b/docs/Campus-Update-Backend-API-Contract.docx
@@ -11240,6 +11240,55 @@
         <ns0:t xml:space="preserve">This guide describes the current API implementation and identifies remaining integration and release limitations. Staging and production deployments must be checked independently; source-code presence alone does not confirm deployment.</ns0:t>
       </ns0:r>
     </ns0:p>
+    <w:p xmlns:w="http://schemas.openxmlformats.org/wordprocessingml/2006/main">
+      <w:pPr>
+        <w:pStyle w:val="Heading1"/>
+        <w:pageBreakBefore/>
+      </w:pPr>
+      <w:r>
+        <w:t xml:space="preserve">Admin Portal Follow-up - October 2026</w:t>
+      </w:r>
+    </w:p>
+    <w:p xmlns:w="http://schemas.openxmlformats.org/wordprocessingml/2006/main">
+      <w:pPr>
+        <w:pStyle w:val="Normal"/>
+      </w:pPr>
+      <w:r>
+        <w:t xml:space="preserve">GET /api/v1/admin/audit supports search, administratorId (actorId is retained), action, actionTag (Access, Advertisement, User, School, External event), institutionId, from, to, page, and pageSize. Rows include the actor name, email, role, action text and tag, target, institution ID/name, details, and timestamp. The from date is inclusive and the to date is exclusive.</w:t>
+      </w:r>
+    </w:p>
+    <w:p xmlns:w="http://schemas.openxmlformats.org/wordprocessingml/2006/main">
+      <w:pPr>
+        <w:pStyle w:val="Normal"/>
+      </w:pPr>
+      <w:r>
+        <w:t xml:space="preserve">GET /api/v1/admin/schools returns institution status, studentCount, staffCount, adminCount, liveContentCount, weeklyActiveCount (distinct users active in the previous seven days), and viewCount (recorded unique content-detail views). GET /api/v1/admin/users returns name, email, role, institution, isActive, createdAt, and lastActiveAt with paging and filters.</w:t>
+      </w:r>
+    </w:p>
+    <w:p xmlns:w="http://schemas.openxmlformats.org/wordprocessingml/2006/main">
+      <w:pPr>
+        <w:pStyle w:val="Normal"/>
+      </w:pPr>
+      <w:r>
+        <w:t xml:space="preserve">Content responses include views, uniqueReachCount, and notificationOpenCount. Views and uniqueReachCount currently represent distinct content-detail views by authenticated students/staff. Feed impressions are not tracked.</w:t>
+      </w:r>
+    </w:p>
+    <w:p xmlns:w="http://schemas.openxmlformats.org/wordprocessingml/2006/main">
+      <w:pPr>
+        <w:pStyle w:val="Normal"/>
+      </w:pPr>
+      <w:r>
+        <w:t xml:space="preserve">POST /api/v1/auth/change-password accepts currentPassword and newPassword. Success returns 204 and invalidates the refresh token. GET /api/v1/auth/sessions, DELETE /api/v1/auth/sessions/{id}, and DELETE /api/v1/auth/sessions/others support session management. The current token model stores one refreshable session per user; access tokens already issued expire normally, and device/IP/browser metadata are not recorded.</w:t>
+      </w:r>
+    </w:p>
+    <w:p xmlns:w="http://schemas.openxmlformats.org/wordprocessingml/2006/main">
+      <w:pPr>
+        <w:pStyle w:val="Normal"/>
+      </w:pPr>
+      <w:r>
+        <w:t xml:space="preserve">Optional follow-up: PUT /api/v1/admin/platform-settings and PUT /api/v1/auth/notification-preferences are not implemented. Persistent platform settings and additional email/cadence preference fields are required before these can be supported.</w:t>
+      </w:r>
+    </w:p>
     <ns0:sectPr ns0:rsidR="00FC693F" ns0:rsidRPr="0006063C" ns0:rsidSect="00034616">
       <ns0:headerReference ns0:type="default" ns2:id="rId9"/>
       <ns0:footerReference ns0:type="default" ns2:id="rId10"/>

</xml_diff>

<commit_message>
docs: update frontend API contract
</commit_message>
<xml_diff>
--- a/docs/Campus-Update-Backend-API-Contract.docx
+++ b/docs/Campus-Update-Backend-API-Contract.docx
@@ -178,9 +178,9 @@
       <ns0:pPr>
         <ns0:pStyle ns0:val="Small"/>
       </ns0:pPr>
-      <ns0:r>
-        <ns0:t>Documentation revision: 13 October 2026</ns0:t>
-      </ns0:r>
+      <w:r xmlns:w="http://schemas.openxmlformats.org/wordprocessingml/2006/main">
+        <w:t>Documentation revision: 18 October 2026</w:t>
+      </w:r>
     </ns0:p>
     <ns0:p>
       <ns0:pPr>
@@ -6034,6 +6034,62 @@
         <ns0:t>Returns 401 for an invalid, expired or superseded token, or an inactive account. Save both returned tokens before issuing more protected requests.</ns0:t>
       </ns0:r>
     </ns0:p>
+    <w:p xmlns:w="http://schemas.openxmlformats.org/wordprocessingml/2006/main">
+      <w:pPr>
+        <w:pStyle w:val="Heading3"/>
+      </w:pPr>
+      <w:r>
+        <w:t>Change password</w:t>
+      </w:r>
+    </w:p>
+    <w:p xmlns:w="http://schemas.openxmlformats.org/wordprocessingml/2006/main">
+      <w:pPr>
+        <w:pStyle w:val="Normal"/>
+      </w:pPr>
+      <w:r>
+        <w:t>POST /api/v1/auth/change-password | Access: Bearer | Success: 204</w:t>
+      </w:r>
+    </w:p>
+    <w:p xmlns:w="http://schemas.openxmlformats.org/wordprocessingml/2006/main">
+      <w:pPr>
+        <w:pStyle w:val="Normal"/>
+      </w:pPr>
+      <w:r>
+        <w:t>{"currentPassword":"CURRENT_PASSWORD","newPassword":"NEW_PASSWORD"}</w:t>
+      </w:r>
+    </w:p>
+    <w:p xmlns:w="http://schemas.openxmlformats.org/wordprocessingml/2006/main">
+      <w:pPr>
+        <w:pStyle w:val="Normal"/>
+      </w:pPr>
+      <w:r>
+        <w:t>The current password must be correct and the new password must be at least eight characters and different from the current password. A successful change invalidates the stored refresh token; existing access tokens expire normally.</w:t>
+      </w:r>
+    </w:p>
+    <w:p xmlns:w="http://schemas.openxmlformats.org/wordprocessingml/2006/main">
+      <w:pPr>
+        <w:pStyle w:val="Heading3"/>
+      </w:pPr>
+      <w:r>
+        <w:t>Login sessions</w:t>
+      </w:r>
+    </w:p>
+    <w:p xmlns:w="http://schemas.openxmlformats.org/wordprocessingml/2006/main">
+      <w:pPr>
+        <w:pStyle w:val="Normal"/>
+      </w:pPr>
+      <w:r>
+        <w:t>GET /api/v1/auth/sessions | Access: Bearer | Success: 200 + session array</w:t>
+      </w:r>
+    </w:p>
+    <w:p xmlns:w="http://schemas.openxmlformats.org/wordprocessingml/2006/main">
+      <w:pPr>
+        <w:pStyle w:val="Normal"/>
+      </w:pPr>
+      <w:r>
+        <w:t>DELETE /api/v1/auth/sessions/{id} revokes the listed refreshable session. DELETE /api/v1/auth/sessions/others signs out other sessions. The current token model stores one refreshable session per account, so concurrent sessions are not available. Access tokens already issued expire normally; device, IP and browser metadata are not recorded.</w:t>
+      </w:r>
+    </w:p>
     <ns0:p>
       <ns0:pPr>
         <ns0:pStyle ns0:val="Heading1"/>
@@ -9435,9 +9491,9 @@
       </ns0:r>
     </ns0:p>
     <ns0:p>
-      <ns0:r>
-        <ns0:t xml:space="preserve">List schools ? GET /api/v1/admin/schools (SuperAdmin). Optional filters: search, isActive, page, pageSize. Returns {page, pageSize, totalCount, items}; each item includes school status and studentCount, staffCount, adminCount (SchoolAdmin accounts), and liveContentCount (distinct Published content targeted to the school). User counts include inactive accounts.</ns0:t>
-      </ns0:r>
+      <w:r xmlns:w="http://schemas.openxmlformats.org/wordprocessingml/2006/main">
+        <w:t>List schools - GET /api/v1/admin/schools (SuperAdmin). Optional filters: search, isActive, page and pageSize. Returns {page, pageSize, totalCount, items}. Each school item includes id, name, slug, state, acronym, logoUrl, isActive, studentCount, staffCount, adminCount, liveContentCount, weeklyActiveCount and viewCount. weeklyActiveCount is the distinct number of users with recorded activity in the prior seven days. viewCount is the count of recorded unique content-detail views for the institution. User counts include inactive accounts.</w:t>
+      </w:r>
     </ns0:p>
     <ns0:p>
       <ns0:r>
@@ -9445,19 +9501,19 @@
       </ns0:r>
     </ns0:p>
     <ns0:p>
-      <ns0:r>
-        <ns0:t xml:space="preserve">List users ? GET /api/v1/admin/users (SuperAdmin). Optional filters: institutionId, role, isActive, search, page, pageSize. Each item includes id, email, firstName, lastName, role, institutionId, institutionName, isActive, createdAt and lastActiveAt. lastActiveAt is the latest recorded authentication/feed activity or content-detail view, and is null when no such activity exists.</ns0:t>
-      </ns0:r>
-    </ns0:p>
-    <ns0:p>
-      <ns0:r>
-        <ns0:t xml:space="preserve">Read the audit log ? GET /api/v1/admin/audit (SuperAdmin). Optional filters: institutionId, actorId, targetId, action, from, to, page, pageSize. Returns newest-first actor identity, action, target ID/type, institution, details and createdAt. from is inclusive and to is exclusive.</ns0:t>
-      </ns0:r>
-    </ns0:p>
-    <ns0:p>
-      <ns0:r>
-        <ns0:t xml:space="preserve">Content metrics: uniqueReachCount counts distinct student/staff accounts that opened a content detail page (one per account per item). notificationOpenCount counts opened notification records for that item. Feed-card impressions are not currently tracked; notification opens and content-detail views are separate signals.</ns0:t>
-      </ns0:r>
+      <w:r xmlns:w="http://schemas.openxmlformats.org/wordprocessingml/2006/main">
+        <w:t>List users - GET /api/v1/admin/users (SuperAdmin). Optional filters: institutionId, role, isActive, search, page and pageSize. Each item includes id, email, firstName, lastName, role, institutionId, institutionName, isActive, createdAt and lastActiveAt. lastActiveAt is the latest recorded authentication/feed activity or content-detail view, and is null when no such activity exists.</w:t>
+      </w:r>
+    </ns0:p>
+    <ns0:p>
+      <w:r xmlns:w="http://schemas.openxmlformats.org/wordprocessingml/2006/main">
+        <w:t>Read the audit log - GET /api/v1/admin/audit (SuperAdmin). Optional filters: search, administratorId (actorId is an alias), action, actionTag, institutionId, targetId, from, to, page and pageSize. Supported action tags are Access, Advertisement, User, School and External event. Rows include actor ID/name/email/role, action text and tag, target ID/type, institution ID/name, details and createdAt. Results are newest first; from is inclusive and to is exclusive.</w:t>
+      </w:r>
+    </ns0:p>
+    <ns0:p>
+      <w:r xmlns:w="http://schemas.openxmlformats.org/wordprocessingml/2006/main">
+        <w:t>Content metrics: content responses expose views, uniqueReachCount and notificationOpenCount. views and uniqueReachCount count distinct authenticated student/staff accounts that opened a content detail page (one per account per item); they do not count feed-card impressions. notificationOpenCount counts opened notification records and is a separate signal.</w:t>
+      </w:r>
     </ns0:p>
     <ns0:p>
       <ns0:pPr>
@@ -9866,6 +9922,14 @@
         <ns0:t xml:space="preserve">Content attachment upload accepts JPEG, PNG, WebP and PDF with type and size checks; signature inspection and image compression are not implemented for these attachments. Calendar image upload is a separate route that verifies and compresses PNG, JPEG or WebP images. No attachment-list/delete route exists, and content responses do not expose attachment IDs; retain the attachmentId returned by upload.</ns0:t>
       </ns0:r>
     </ns0:p>
+    <w:p xmlns:w="http://schemas.openxmlformats.org/wordprocessingml/2006/main">
+      <w:pPr>
+        <w:pStyle w:val="Normal"/>
+      </w:pPr>
+      <w:r>
+        <w:t>Optional settings routes requested by the admin UI are not implemented: PUT /api/v1/admin/platform-settings and PUT /api/v1/auth/notification-preferences. They require persistent platform settings and additional email/push and summary-cadence preference fields.</w:t>
+      </w:r>
+    </w:p>
     <ns0:p>
       <ns0:pPr>
         <ns0:pStyle ns0:val="Heading1"/>
@@ -11240,55 +11304,6 @@
         <ns0:t xml:space="preserve">This guide describes the current API implementation and identifies remaining integration and release limitations. Staging and production deployments must be checked independently; source-code presence alone does not confirm deployment.</ns0:t>
       </ns0:r>
     </ns0:p>
-    <w:p xmlns:w="http://schemas.openxmlformats.org/wordprocessingml/2006/main">
-      <w:pPr>
-        <w:pStyle w:val="Heading1"/>
-        <w:pageBreakBefore/>
-      </w:pPr>
-      <w:r>
-        <w:t xml:space="preserve">Admin Portal Follow-up - October 2026</w:t>
-      </w:r>
-    </w:p>
-    <w:p xmlns:w="http://schemas.openxmlformats.org/wordprocessingml/2006/main">
-      <w:pPr>
-        <w:pStyle w:val="Normal"/>
-      </w:pPr>
-      <w:r>
-        <w:t xml:space="preserve">GET /api/v1/admin/audit supports search, administratorId (actorId is retained), action, actionTag (Access, Advertisement, User, School, External event), institutionId, from, to, page, and pageSize. Rows include the actor name, email, role, action text and tag, target, institution ID/name, details, and timestamp. The from date is inclusive and the to date is exclusive.</w:t>
-      </w:r>
-    </w:p>
-    <w:p xmlns:w="http://schemas.openxmlformats.org/wordprocessingml/2006/main">
-      <w:pPr>
-        <w:pStyle w:val="Normal"/>
-      </w:pPr>
-      <w:r>
-        <w:t xml:space="preserve">GET /api/v1/admin/schools returns institution status, studentCount, staffCount, adminCount, liveContentCount, weeklyActiveCount (distinct users active in the previous seven days), and viewCount (recorded unique content-detail views). GET /api/v1/admin/users returns name, email, role, institution, isActive, createdAt, and lastActiveAt with paging and filters.</w:t>
-      </w:r>
-    </w:p>
-    <w:p xmlns:w="http://schemas.openxmlformats.org/wordprocessingml/2006/main">
-      <w:pPr>
-        <w:pStyle w:val="Normal"/>
-      </w:pPr>
-      <w:r>
-        <w:t xml:space="preserve">Content responses include views, uniqueReachCount, and notificationOpenCount. Views and uniqueReachCount currently represent distinct content-detail views by authenticated students/staff. Feed impressions are not tracked.</w:t>
-      </w:r>
-    </w:p>
-    <w:p xmlns:w="http://schemas.openxmlformats.org/wordprocessingml/2006/main">
-      <w:pPr>
-        <w:pStyle w:val="Normal"/>
-      </w:pPr>
-      <w:r>
-        <w:t xml:space="preserve">POST /api/v1/auth/change-password accepts currentPassword and newPassword. Success returns 204 and invalidates the refresh token. GET /api/v1/auth/sessions, DELETE /api/v1/auth/sessions/{id}, and DELETE /api/v1/auth/sessions/others support session management. The current token model stores one refreshable session per user; access tokens already issued expire normally, and device/IP/browser metadata are not recorded.</w:t>
-      </w:r>
-    </w:p>
-    <w:p xmlns:w="http://schemas.openxmlformats.org/wordprocessingml/2006/main">
-      <w:pPr>
-        <w:pStyle w:val="Normal"/>
-      </w:pPr>
-      <w:r>
-        <w:t xml:space="preserve">Optional follow-up: PUT /api/v1/admin/platform-settings and PUT /api/v1/auth/notification-preferences are not implemented. Persistent platform settings and additional email/cadence preference fields are required before these can be supported.</w:t>
-      </w:r>
-    </w:p>
     <ns0:sectPr ns0:rsidR="00FC693F" ns0:rsidRPr="0006063C" ns0:rsidSect="00034616">
       <ns0:headerReference ns0:type="default" ns2:id="rId9"/>
       <ns0:footerReference ns0:type="default" ns2:id="rId10"/>

</xml_diff>